<commit_message>
Created the prompt.md and design.md file
</commit_message>
<xml_diff>
--- a/Quest1_prompts.docx
+++ b/Quest1_prompts.docx
@@ -49,83 +49,59 @@
         <w:rPr>
           <w:sz w:val="28"/>
           <w:szCs w:val="28"/>
-          <w:lang w:val="en-US"/>
-        </w:rPr>
-      </w:pPr>
-      <w:r>
-        <w:rPr>
-          <w:sz w:val="28"/>
-          <w:szCs w:val="28"/>
-          <w:lang w:val="en-US"/>
-        </w:rPr>
-        <w:t xml:space="preserve">I solely used Gemini and </w:t>
-      </w:r>
-      <w:r>
-        <w:rPr>
-          <w:sz w:val="28"/>
-          <w:szCs w:val="28"/>
-          <w:lang w:val="en-US"/>
-        </w:rPr>
-        <w:t>Antigravity</w:t>
-      </w:r>
-    </w:p>
-    <w:p>
-      <w:pPr>
-        <w:rPr>
-          <w:sz w:val="28"/>
-          <w:szCs w:val="28"/>
-          <w:lang w:val="en-US"/>
-        </w:rPr>
-      </w:pPr>
-      <w:r>
-        <w:rPr>
-          <w:sz w:val="28"/>
-          <w:szCs w:val="28"/>
-          <w:lang w:val="en-US"/>
-        </w:rPr>
-        <w:t xml:space="preserve">Before starting to prompt, I just wrote my solution down in a text editor. Then I </w:t>
-      </w:r>
-      <w:proofErr w:type="gramStart"/>
-      <w:r>
-        <w:rPr>
-          <w:sz w:val="28"/>
-          <w:szCs w:val="28"/>
-          <w:lang w:val="en-US"/>
-        </w:rPr>
-        <w:t>pasted</w:t>
-      </w:r>
-      <w:proofErr w:type="gramEnd"/>
-      <w:r>
-        <w:rPr>
-          <w:sz w:val="28"/>
-          <w:szCs w:val="28"/>
-          <w:lang w:val="en-US"/>
-        </w:rPr>
-        <w:t xml:space="preserve"> the PS along with my idea. </w:t>
-      </w:r>
-      <w:r>
-        <w:rPr>
-          <w:sz w:val="28"/>
-          <w:szCs w:val="28"/>
-          <w:lang w:val="en-US"/>
-        </w:rPr>
-        <w:t>So,</w:t>
-      </w:r>
-      <w:r>
-        <w:rPr>
-          <w:sz w:val="28"/>
-          <w:szCs w:val="28"/>
-          <w:lang w:val="en-US"/>
-        </w:rPr>
-        <w:t xml:space="preserve"> I just don’t follow what AI says, I guide AI to what I think I want to do</w:t>
-      </w:r>
-      <w:r>
-        <w:rPr>
-          <w:sz w:val="28"/>
-          <w:szCs w:val="28"/>
-          <w:lang w:val="en-US"/>
-        </w:rPr>
-        <w:t>.</w:t>
+        </w:rPr>
+      </w:pPr>
+      <w:r>
+        <w:rPr>
+          <w:sz w:val="28"/>
+          <w:szCs w:val="28"/>
+        </w:rPr>
+        <w:t>Gemini and Antigravity were the only AI coding assistants used during this project.</w:t>
+      </w:r>
+    </w:p>
+    <w:p>
+      <w:pPr>
+        <w:rPr>
+          <w:sz w:val="28"/>
+          <w:szCs w:val="28"/>
+        </w:rPr>
+      </w:pPr>
+      <w:r>
+        <w:rPr>
+          <w:sz w:val="28"/>
+          <w:szCs w:val="28"/>
+        </w:rPr>
+        <w:t>Before using either tool, I independently analyzed the problem statement and documented an initial solution approach in a text editor. I then provided both the problem statement and my proposed approach to Gemini to refine the design, evaluate technology choices, and identify potential failure cases.</w:t>
+      </w:r>
+    </w:p>
+    <w:p>
+      <w:pPr>
+        <w:rPr>
+          <w:sz w:val="28"/>
+          <w:szCs w:val="28"/>
+        </w:rPr>
+      </w:pPr>
+      <w:r>
+        <w:rPr>
+          <w:sz w:val="28"/>
+          <w:szCs w:val="28"/>
+        </w:rPr>
+        <w:t>The AI tools were therefore used as engineering assistants rather than as the source of the initial solution. The architecture evolved through implementation, testing, and debugging, with several design decisions being changed after issues were encountered on real video URLs.</w:t>
+      </w:r>
+    </w:p>
+    <w:p>
+      <w:pPr>
+        <w:rPr>
+          <w:sz w:val="28"/>
+          <w:szCs w:val="28"/>
+        </w:rPr>
+      </w:pPr>
+      <w:r>
+        <w:rPr>
+          <w:sz w:val="28"/>
+          <w:szCs w:val="28"/>
+        </w:rPr>
+        <w:t>The following sections document the major prompts that guided the design and implementation process</w:t>
       </w:r>
     </w:p>
     <w:p>
@@ -184,34 +160,7 @@
           <w:szCs w:val="28"/>
           <w:lang w:val="en-US"/>
         </w:rPr>
-        <w:t xml:space="preserve"> thought of downloading the vid along with its audio for the link given (any vid </w:t>
-      </w:r>
-      <w:proofErr w:type="spellStart"/>
-      <w:r>
-        <w:rPr>
-          <w:sz w:val="28"/>
-          <w:szCs w:val="28"/>
-          <w:lang w:val="en-US"/>
-        </w:rPr>
-        <w:t>url</w:t>
-      </w:r>
-      <w:proofErr w:type="spellEnd"/>
-      <w:r>
-        <w:rPr>
-          <w:sz w:val="28"/>
-          <w:szCs w:val="28"/>
-          <w:lang w:val="en-US"/>
-        </w:rPr>
-        <w:t xml:space="preserve">, </w:t>
-      </w:r>
-      <w:proofErr w:type="gramStart"/>
-      <w:r>
-        <w:rPr>
-          <w:sz w:val="28"/>
-          <w:szCs w:val="28"/>
-          <w:lang w:val="en-US"/>
-        </w:rPr>
-        <w:t xml:space="preserve">not only </w:t>
+        <w:t xml:space="preserve"> thought of downloading the vid along with its audio for the link given (any vid url, not only </w:t>
       </w:r>
       <w:r>
         <w:rPr>
@@ -245,7 +194,6 @@
         </w:rPr>
         <w:t>ube</w:t>
       </w:r>
-      <w:proofErr w:type="gramEnd"/>
       <w:r>
         <w:rPr>
           <w:sz w:val="28"/>
@@ -284,35 +232,7 @@
           <w:szCs w:val="28"/>
           <w:lang w:val="en-US"/>
         </w:rPr>
-        <w:t xml:space="preserve"> and its timestamp and get the vid frame. If the CC transcription is not available</w:t>
-      </w:r>
-      <w:proofErr w:type="gramStart"/>
-      <w:r>
-        <w:rPr>
-          <w:sz w:val="28"/>
-          <w:szCs w:val="28"/>
-          <w:lang w:val="en-US"/>
-        </w:rPr>
-        <w:t xml:space="preserve">, </w:t>
-      </w:r>
-      <w:proofErr w:type="spellStart"/>
-      <w:r>
-        <w:rPr>
-          <w:sz w:val="28"/>
-          <w:szCs w:val="28"/>
-          <w:lang w:val="en-US"/>
-        </w:rPr>
-        <w:t>i</w:t>
-      </w:r>
-      <w:proofErr w:type="spellEnd"/>
-      <w:proofErr w:type="gramEnd"/>
-      <w:r>
-        <w:rPr>
-          <w:sz w:val="28"/>
-          <w:szCs w:val="28"/>
-          <w:lang w:val="en-US"/>
-        </w:rPr>
-        <w:t xml:space="preserve"> just need to extract the audio and convert that to text using some transformer and get the text along with its timestamp back. Then use the same string matching. But what if the audio or the transformer arch is not that great and mediocre. Then we must find the most relevant match and use a sliding window like +-3 sec on that timestamp and check the text and find out. </w:t>
+        <w:t xml:space="preserve"> and its timestamp and get the vid frame. If the CC transcription is not available, i just need to extract the audio and convert that to text using some transformer and get the text along with its timestamp back. Then use the same string matching. But what if the audio or the transformer arch is not that great and mediocre. Then we must find the most relevant match and use a sliding window like +-3 sec on that timestamp and check the text and find out. </w:t>
       </w:r>
     </w:p>
     <w:p>
@@ -452,25 +372,7 @@
           <w:szCs w:val="28"/>
           <w:lang w:val="en-US"/>
         </w:rPr>
-        <w:t xml:space="preserve"> to use to do these things, first </w:t>
-      </w:r>
-      <w:proofErr w:type="gramStart"/>
-      <w:r>
-        <w:rPr>
-          <w:sz w:val="28"/>
-          <w:szCs w:val="28"/>
-          <w:lang w:val="en-US"/>
-        </w:rPr>
-        <w:t>lets</w:t>
-      </w:r>
-      <w:proofErr w:type="gramEnd"/>
-      <w:r>
-        <w:rPr>
-          <w:sz w:val="28"/>
-          <w:szCs w:val="28"/>
-          <w:lang w:val="en-US"/>
-        </w:rPr>
-        <w:t xml:space="preserve"> refine the idea.</w:t>
+        <w:t xml:space="preserve"> to use to do these things, first lets refine the idea.</w:t>
       </w:r>
     </w:p>
     <w:p>
@@ -518,25 +420,7 @@
           <w:szCs w:val="28"/>
           <w:lang w:val="en-US"/>
         </w:rPr>
-        <w:t xml:space="preserve"> discuss what technology stack can be used and its alternatives. Give me the best tech to use in each step of my </w:t>
-      </w:r>
-      <w:proofErr w:type="gramStart"/>
-      <w:r>
-        <w:rPr>
-          <w:sz w:val="28"/>
-          <w:szCs w:val="28"/>
-          <w:lang w:val="en-US"/>
-        </w:rPr>
-        <w:t>sol</w:t>
-      </w:r>
-      <w:proofErr w:type="gramEnd"/>
-      <w:r>
-        <w:rPr>
-          <w:sz w:val="28"/>
-          <w:szCs w:val="28"/>
-          <w:lang w:val="en-US"/>
-        </w:rPr>
-        <w:t xml:space="preserve"> by </w:t>
+        <w:t xml:space="preserve"> discuss what technology stack can be used and its alternatives. Give me the best tech to use in each step of my sol by </w:t>
       </w:r>
       <w:r>
         <w:rPr>
@@ -600,25 +484,7 @@
           <w:szCs w:val="28"/>
           <w:lang w:val="en-US"/>
         </w:rPr>
-        <w:t xml:space="preserve">Now give the requirements.txt file content, so I can first create a </w:t>
-      </w:r>
-      <w:proofErr w:type="spellStart"/>
-      <w:r>
-        <w:rPr>
-          <w:sz w:val="28"/>
-          <w:szCs w:val="28"/>
-          <w:lang w:val="en-US"/>
-        </w:rPr>
-        <w:t>venv</w:t>
-      </w:r>
-      <w:proofErr w:type="spellEnd"/>
-      <w:r>
-        <w:rPr>
-          <w:sz w:val="28"/>
-          <w:szCs w:val="28"/>
-          <w:lang w:val="en-US"/>
-        </w:rPr>
-        <w:t xml:space="preserve"> after you decide the stack</w:t>
+        <w:t>Now give the requirements.txt file content, so I can first create a venv after you decide the stack</w:t>
       </w:r>
     </w:p>
     <w:p>
@@ -650,7 +516,6 @@
           <w:szCs w:val="28"/>
           <w:lang w:val="en-US"/>
         </w:rPr>
-        <w:lastRenderedPageBreak/>
         <w:t xml:space="preserve">Now give a master prompt for antigravity to implement my solution with the tech stack we </w:t>
       </w:r>
       <w:r>
@@ -667,25 +532,7 @@
           <w:szCs w:val="28"/>
           <w:lang w:val="en-US"/>
         </w:rPr>
-        <w:t xml:space="preserve">, make sure it follows all the correct coding </w:t>
-      </w:r>
-      <w:proofErr w:type="gramStart"/>
-      <w:r>
-        <w:rPr>
-          <w:sz w:val="28"/>
-          <w:szCs w:val="28"/>
-          <w:lang w:val="en-US"/>
-        </w:rPr>
-        <w:t>principle</w:t>
-      </w:r>
-      <w:proofErr w:type="gramEnd"/>
-      <w:r>
-        <w:rPr>
-          <w:sz w:val="28"/>
-          <w:szCs w:val="28"/>
-          <w:lang w:val="en-US"/>
-        </w:rPr>
-        <w:t xml:space="preserve"> and good practices. </w:t>
+        <w:t xml:space="preserve">, make sure it follows all the correct coding principle and good practices. </w:t>
       </w:r>
     </w:p>
     <w:p>
@@ -727,25 +574,7 @@
           <w:szCs w:val="28"/>
           <w:lang w:val="en-US"/>
         </w:rPr>
-        <w:t xml:space="preserve">Give me the estimated time for running my pipeline for a 1 </w:t>
-      </w:r>
-      <w:proofErr w:type="spellStart"/>
-      <w:r>
-        <w:rPr>
-          <w:sz w:val="28"/>
-          <w:szCs w:val="28"/>
-          <w:lang w:val="en-US"/>
-        </w:rPr>
-        <w:t>hr</w:t>
-      </w:r>
-      <w:proofErr w:type="spellEnd"/>
-      <w:r>
-        <w:rPr>
-          <w:sz w:val="28"/>
-          <w:szCs w:val="28"/>
-          <w:lang w:val="en-US"/>
-        </w:rPr>
-        <w:t xml:space="preserve"> video.</w:t>
+        <w:t>Give me the estimated time for running my pipeline for a 1 hr video.</w:t>
       </w:r>
     </w:p>
     <w:p>
@@ -777,25 +606,7 @@
           <w:szCs w:val="28"/>
           <w:lang w:val="en-US"/>
         </w:rPr>
-        <w:t xml:space="preserve">Broo, that’s </w:t>
-      </w:r>
-      <w:proofErr w:type="spellStart"/>
-      <w:r>
-        <w:rPr>
-          <w:sz w:val="28"/>
-          <w:szCs w:val="28"/>
-          <w:lang w:val="en-US"/>
-        </w:rPr>
-        <w:t>soo</w:t>
-      </w:r>
-      <w:proofErr w:type="spellEnd"/>
-      <w:r>
-        <w:rPr>
-          <w:sz w:val="28"/>
-          <w:szCs w:val="28"/>
-          <w:lang w:val="en-US"/>
-        </w:rPr>
-        <w:t xml:space="preserve"> expensive, ig downloading the vid in high quality is the bottleneck, how can we mitigate that.</w:t>
+        <w:t>Broo, that’s soo expensive, ig downloading the vid in high quality is the bottleneck, how can we mitigate that.</w:t>
       </w:r>
     </w:p>
     <w:p>
@@ -845,45 +656,7 @@
           <w:szCs w:val="28"/>
           <w:lang w:val="en-US"/>
         </w:rPr>
-        <w:t xml:space="preserve">Is there some way to use </w:t>
-      </w:r>
-      <w:proofErr w:type="spellStart"/>
-      <w:proofErr w:type="gramStart"/>
-      <w:r>
-        <w:rPr>
-          <w:sz w:val="28"/>
-          <w:szCs w:val="28"/>
-          <w:lang w:val="en-US"/>
-        </w:rPr>
-        <w:t>a</w:t>
-      </w:r>
-      <w:proofErr w:type="spellEnd"/>
-      <w:proofErr w:type="gramEnd"/>
-      <w:r>
-        <w:rPr>
-          <w:sz w:val="28"/>
-          <w:szCs w:val="28"/>
-          <w:lang w:val="en-US"/>
-        </w:rPr>
-        <w:t xml:space="preserve"> efficient model, I used quantized version of llama for my daily task. Search for some </w:t>
-      </w:r>
-      <w:proofErr w:type="gramStart"/>
-      <w:r>
-        <w:rPr>
-          <w:sz w:val="28"/>
-          <w:szCs w:val="28"/>
-          <w:lang w:val="en-US"/>
-        </w:rPr>
-        <w:t>quantized</w:t>
-      </w:r>
-      <w:proofErr w:type="gramEnd"/>
-      <w:r>
-        <w:rPr>
-          <w:sz w:val="28"/>
-          <w:szCs w:val="28"/>
-          <w:lang w:val="en-US"/>
-        </w:rPr>
-        <w:t xml:space="preserve"> version of the whisper so it can be done efficiently.</w:t>
+        <w:t>Is there some way to use a efficient model, I used quantized version of llama for my daily task. Search for some quantized version of the whisper so it can be done efficiently.</w:t>
       </w:r>
     </w:p>
     <w:p>
@@ -915,25 +688,7 @@
           <w:szCs w:val="28"/>
           <w:lang w:val="en-US"/>
         </w:rPr>
-        <w:t xml:space="preserve">Except for </w:t>
-      </w:r>
-      <w:proofErr w:type="gramStart"/>
-      <w:r>
-        <w:rPr>
-          <w:sz w:val="28"/>
-          <w:szCs w:val="28"/>
-          <w:lang w:val="en-US"/>
-        </w:rPr>
-        <w:t>quantization</w:t>
-      </w:r>
-      <w:proofErr w:type="gramEnd"/>
-      <w:r>
-        <w:rPr>
-          <w:sz w:val="28"/>
-          <w:szCs w:val="28"/>
-          <w:lang w:val="en-US"/>
-        </w:rPr>
-        <w:t xml:space="preserve"> what other optimizations can we use?</w:t>
+        <w:t>Except for quantization what other optimizations can we use?</w:t>
       </w:r>
     </w:p>
     <w:p>
@@ -965,83 +720,7 @@
           <w:szCs w:val="28"/>
           <w:lang w:val="en-US"/>
         </w:rPr>
-        <w:t xml:space="preserve">Ji, I found a hole in my solution. When the vid has inbuilt CC, it is somewhat delayed or not correctly synced with the audio spoken. </w:t>
-      </w:r>
-      <w:proofErr w:type="gramStart"/>
-      <w:r>
-        <w:rPr>
-          <w:sz w:val="28"/>
-          <w:szCs w:val="28"/>
-          <w:lang w:val="en-US"/>
-        </w:rPr>
-        <w:t>So</w:t>
-      </w:r>
-      <w:proofErr w:type="gramEnd"/>
-      <w:r>
-        <w:rPr>
-          <w:sz w:val="28"/>
-          <w:szCs w:val="28"/>
-          <w:lang w:val="en-US"/>
-        </w:rPr>
-        <w:t xml:space="preserve"> let’s always run the audio processing pipeline even when .</w:t>
-      </w:r>
-      <w:proofErr w:type="spellStart"/>
-      <w:r>
-        <w:rPr>
-          <w:sz w:val="28"/>
-          <w:szCs w:val="28"/>
-          <w:lang w:val="en-US"/>
-        </w:rPr>
-        <w:t>srt</w:t>
-      </w:r>
-      <w:proofErr w:type="spellEnd"/>
-      <w:r>
-        <w:rPr>
-          <w:sz w:val="28"/>
-          <w:szCs w:val="28"/>
-          <w:lang w:val="en-US"/>
-        </w:rPr>
-        <w:t xml:space="preserve"> file is present. Then we can cross check both and display the delay of CC </w:t>
-      </w:r>
-      <w:proofErr w:type="spellStart"/>
-      <w:proofErr w:type="gramStart"/>
-      <w:r>
-        <w:rPr>
-          <w:sz w:val="28"/>
-          <w:szCs w:val="28"/>
-          <w:lang w:val="en-US"/>
-        </w:rPr>
-        <w:t>aswell</w:t>
-      </w:r>
-      <w:proofErr w:type="spellEnd"/>
-      <w:proofErr w:type="gramEnd"/>
-      <w:r>
-        <w:rPr>
-          <w:sz w:val="28"/>
-          <w:szCs w:val="28"/>
-          <w:lang w:val="en-US"/>
-        </w:rPr>
-        <w:t xml:space="preserve"> (like </w:t>
-      </w:r>
-      <w:proofErr w:type="spellStart"/>
-      <w:proofErr w:type="gramStart"/>
-      <w:r>
-        <w:rPr>
-          <w:sz w:val="28"/>
-          <w:szCs w:val="28"/>
-          <w:lang w:val="en-US"/>
-        </w:rPr>
-        <w:t>a</w:t>
-      </w:r>
-      <w:proofErr w:type="spellEnd"/>
-      <w:proofErr w:type="gramEnd"/>
-      <w:r>
-        <w:rPr>
-          <w:sz w:val="28"/>
-          <w:szCs w:val="28"/>
-          <w:lang w:val="en-US"/>
-        </w:rPr>
-        <w:t xml:space="preserve"> extra additional feature)</w:t>
+        <w:t>Ji, I found a hole in my solution. When the vid has inbuilt CC, it is somewhat delayed or not correctly synced with the audio spoken. So let’s always run the audio processing pipeline even when .srt file is present. Then we can cross check both and display the delay of CC aswell (like a extra additional feature)</w:t>
       </w:r>
       <w:r>
         <w:rPr>
@@ -1081,139 +760,16 @@
           <w:szCs w:val="28"/>
           <w:lang w:val="en-US"/>
         </w:rPr>
-        <w:t xml:space="preserve">As of now we are only </w:t>
-      </w:r>
-      <w:proofErr w:type="spellStart"/>
-      <w:r>
-        <w:rPr>
-          <w:sz w:val="28"/>
-          <w:szCs w:val="28"/>
-          <w:lang w:val="en-US"/>
-        </w:rPr>
-        <w:t>gonna</w:t>
-      </w:r>
-      <w:proofErr w:type="spellEnd"/>
-      <w:r>
-        <w:rPr>
-          <w:sz w:val="28"/>
-          <w:szCs w:val="28"/>
-          <w:lang w:val="en-US"/>
-        </w:rPr>
-        <w:t xml:space="preserve"> run the </w:t>
-      </w:r>
-      <w:proofErr w:type="spellStart"/>
-      <w:r>
-        <w:rPr>
-          <w:sz w:val="28"/>
-          <w:szCs w:val="28"/>
-          <w:lang w:val="en-US"/>
-        </w:rPr>
-        <w:t>baseline_audio</w:t>
-      </w:r>
-      <w:proofErr w:type="spellEnd"/>
-      <w:r>
-        <w:rPr>
-          <w:sz w:val="28"/>
-          <w:szCs w:val="28"/>
-          <w:lang w:val="en-US"/>
-        </w:rPr>
-        <w:t xml:space="preserve"> file, Make a classy sleek modern frontend for this using only HTML, CSS, JS. </w:t>
-      </w:r>
-      <w:proofErr w:type="gramStart"/>
-      <w:r>
-        <w:rPr>
-          <w:sz w:val="28"/>
-          <w:szCs w:val="28"/>
-          <w:lang w:val="en-US"/>
-        </w:rPr>
-        <w:t>it</w:t>
-      </w:r>
-      <w:proofErr w:type="gramEnd"/>
-      <w:r>
-        <w:rPr>
-          <w:sz w:val="28"/>
-          <w:szCs w:val="28"/>
-          <w:lang w:val="en-US"/>
-        </w:rPr>
-        <w:t xml:space="preserve"> should take the </w:t>
-      </w:r>
-      <w:proofErr w:type="spellStart"/>
-      <w:r>
-        <w:rPr>
-          <w:sz w:val="28"/>
-          <w:szCs w:val="28"/>
-          <w:lang w:val="en-US"/>
-        </w:rPr>
-        <w:t>url</w:t>
-      </w:r>
-      <w:proofErr w:type="spellEnd"/>
-      <w:r>
-        <w:rPr>
-          <w:sz w:val="28"/>
-          <w:szCs w:val="28"/>
-          <w:lang w:val="en-US"/>
-        </w:rPr>
-        <w:t xml:space="preserve">, show all the processing steps with ETA and loading bars, then after result is </w:t>
-      </w:r>
-      <w:r>
-        <w:rPr>
-          <w:sz w:val="28"/>
-          <w:szCs w:val="28"/>
-          <w:lang w:val="en-US"/>
-        </w:rPr>
-        <w:t>generated,</w:t>
-      </w:r>
-      <w:r>
-        <w:rPr>
-          <w:sz w:val="28"/>
-          <w:szCs w:val="28"/>
-          <w:lang w:val="en-US"/>
-        </w:rPr>
-        <w:t xml:space="preserve"> it should print the </w:t>
-      </w:r>
-      <w:proofErr w:type="spellStart"/>
-      <w:r>
-        <w:rPr>
-          <w:sz w:val="28"/>
-          <w:szCs w:val="28"/>
-          <w:lang w:val="en-US"/>
-        </w:rPr>
-        <w:t>json</w:t>
-      </w:r>
-      <w:proofErr w:type="spellEnd"/>
-      <w:r>
-        <w:rPr>
-          <w:sz w:val="28"/>
-          <w:szCs w:val="28"/>
-          <w:lang w:val="en-US"/>
-        </w:rPr>
-        <w:t xml:space="preserve"> result </w:t>
-      </w:r>
-      <w:proofErr w:type="gramStart"/>
-      <w:r>
-        <w:rPr>
-          <w:sz w:val="28"/>
-          <w:szCs w:val="28"/>
-          <w:lang w:val="en-US"/>
-        </w:rPr>
-        <w:t>and also</w:t>
-      </w:r>
-      <w:proofErr w:type="gramEnd"/>
-      <w:r>
-        <w:rPr>
-          <w:sz w:val="28"/>
-          <w:szCs w:val="28"/>
-          <w:lang w:val="en-US"/>
-        </w:rPr>
-        <w:t xml:space="preserve"> display the video frame. Plan first</w:t>
-      </w:r>
-      <w:r>
-        <w:rPr>
-          <w:sz w:val="28"/>
-          <w:szCs w:val="28"/>
-          <w:lang w:val="en-US"/>
-        </w:rPr>
-        <w:t>, wait till I approve the plan, then only start to code.</w:t>
+        <w:t xml:space="preserve">As of now we are only gonna run the baseline_audio file, Make a classy sleek modern frontend for this using only HTML, CSS, JS. it should take the url, show all the processing steps with ETA and loading bars, then after result is generated, it should print the json </w:t>
+      </w:r>
+      <w:r>
+        <w:rPr>
+          <w:sz w:val="28"/>
+          <w:szCs w:val="28"/>
+          <w:lang w:val="en-US"/>
+        </w:rPr>
+        <w:lastRenderedPageBreak/>
+        <w:t>result and also display the video frame. Plan first, wait till I approve the plan, then only start to code.</w:t>
       </w:r>
     </w:p>
     <w:p>
@@ -1246,53 +802,12 @@
         </w:rPr>
         <w:t>W</w:t>
       </w:r>
-      <w:proofErr w:type="spellStart"/>
-      <w:r>
-        <w:rPr>
-          <w:sz w:val="28"/>
-          <w:szCs w:val="28"/>
-        </w:rPr>
-        <w:t>hile</w:t>
-      </w:r>
-      <w:proofErr w:type="spellEnd"/>
-      <w:r>
-        <w:rPr>
-          <w:sz w:val="28"/>
-          <w:szCs w:val="28"/>
-        </w:rPr>
-        <w:t xml:space="preserve"> </w:t>
-      </w:r>
-      <w:proofErr w:type="spellStart"/>
-      <w:r>
-        <w:rPr>
-          <w:sz w:val="28"/>
-          <w:szCs w:val="28"/>
-        </w:rPr>
-        <w:t>transcibing</w:t>
-      </w:r>
-      <w:proofErr w:type="spellEnd"/>
-      <w:r>
-        <w:rPr>
-          <w:sz w:val="28"/>
-          <w:szCs w:val="28"/>
-        </w:rPr>
-        <w:t xml:space="preserve"> in the UI it would be good to show the exact minute and the text it </w:t>
-      </w:r>
-      <w:proofErr w:type="spellStart"/>
-      <w:r>
-        <w:rPr>
-          <w:sz w:val="28"/>
-          <w:szCs w:val="28"/>
-        </w:rPr>
-        <w:t>transcipted</w:t>
-      </w:r>
-      <w:proofErr w:type="spellEnd"/>
-      <w:r>
-        <w:rPr>
-          <w:sz w:val="28"/>
-          <w:szCs w:val="28"/>
-        </w:rPr>
-        <w:t xml:space="preserve">, so that users </w:t>
+      <w:r>
+        <w:rPr>
+          <w:sz w:val="28"/>
+          <w:szCs w:val="28"/>
+        </w:rPr>
+        <w:t xml:space="preserve">hile transcibing in the UI it would be good to show the exact minute and the text it transcipted, so that users </w:t>
       </w:r>
       <w:r>
         <w:rPr>
@@ -1306,15 +821,7 @@
           <w:sz w:val="28"/>
           <w:szCs w:val="28"/>
         </w:rPr>
-        <w:t xml:space="preserve"> feel stuck at </w:t>
-      </w:r>
-      <w:proofErr w:type="gramStart"/>
-      <w:r>
-        <w:rPr>
-          <w:sz w:val="28"/>
-          <w:szCs w:val="28"/>
-        </w:rPr>
-        <w:t xml:space="preserve">a same </w:t>
+        <w:t xml:space="preserve"> feel stuck at a same </w:t>
       </w:r>
       <w:r>
         <w:rPr>
@@ -1323,7 +830,6 @@
         </w:rPr>
         <w:t>position</w:t>
       </w:r>
-      <w:proofErr w:type="gramEnd"/>
     </w:p>
     <w:p>
       <w:pPr>
@@ -1366,6 +872,25 @@
     <w:p>
       <w:pPr>
         <w:pStyle w:val="ListParagraph"/>
+        <w:numPr>
+          <w:ilvl w:val="0"/>
+          <w:numId w:val="1"/>
+        </w:numPr>
+        <w:rPr>
+          <w:sz w:val="28"/>
+          <w:szCs w:val="28"/>
+        </w:rPr>
+      </w:pPr>
+      <w:r>
+        <w:rPr>
+          <w:sz w:val="28"/>
+          <w:szCs w:val="28"/>
+        </w:rPr>
+        <w:t>Fine now the UI and solution is done, now I have an idea to pack it as a zero-touch installer and give the .exe file alone to the user. It should open in cmd and start creating a venv and install all the dependencies and start in a available localhost port.</w:t>
+      </w:r>
+    </w:p>
+    <w:p>
+      <w:pPr>
         <w:rPr>
           <w:sz w:val="28"/>
           <w:szCs w:val="28"/>
@@ -1403,40 +928,40 @@
           <w:szCs w:val="28"/>
           <w:lang w:val="en-US"/>
         </w:rPr>
-        <w:t>Each time a pasted a video link, some new error came up, so after solving and going through all of this. I got a working solution.</w:t>
-      </w:r>
-    </w:p>
-    <w:p>
-      <w:pPr>
-        <w:rPr>
-          <w:sz w:val="28"/>
-          <w:szCs w:val="28"/>
-          <w:lang w:val="en-US"/>
-        </w:rPr>
-      </w:pPr>
-      <w:r>
-        <w:rPr>
-          <w:sz w:val="28"/>
-          <w:szCs w:val="28"/>
-          <w:lang w:val="en-US"/>
-        </w:rPr>
-        <w:t xml:space="preserve">There were many errors that happened while running the code, I just </w:t>
-      </w:r>
-      <w:r>
-        <w:rPr>
-          <w:sz w:val="28"/>
-          <w:szCs w:val="28"/>
-          <w:lang w:val="en-US"/>
-        </w:rPr>
-        <w:t>copied</w:t>
-      </w:r>
-      <w:r>
-        <w:rPr>
-          <w:sz w:val="28"/>
-          <w:szCs w:val="28"/>
-          <w:lang w:val="en-US"/>
-        </w:rPr>
-        <w:t xml:space="preserve"> and pasted the error and said to fix (so I did not include those prompts here)</w:t>
+        <w:t xml:space="preserve">Each time </w:t>
+      </w:r>
+      <w:r>
+        <w:rPr>
+          <w:sz w:val="28"/>
+          <w:szCs w:val="28"/>
+          <w:lang w:val="en-US"/>
+        </w:rPr>
+        <w:t>I</w:t>
+      </w:r>
+      <w:r>
+        <w:rPr>
+          <w:sz w:val="28"/>
+          <w:szCs w:val="28"/>
+          <w:lang w:val="en-US"/>
+        </w:rPr>
+        <w:t xml:space="preserve"> pasted a video link, some new error came up, so after solving and going through all of this. I got a working solution.</w:t>
+      </w:r>
+    </w:p>
+    <w:p>
+      <w:pPr>
+        <w:rPr>
+          <w:sz w:val="28"/>
+          <w:szCs w:val="28"/>
+          <w:lang w:val="en-US"/>
+        </w:rPr>
+      </w:pPr>
+      <w:r>
+        <w:rPr>
+          <w:sz w:val="28"/>
+          <w:szCs w:val="28"/>
+          <w:lang w:val="en-US"/>
+        </w:rPr>
+        <w:t>There were many errors that happened while running the code, I just copied and pasted the error and said to fix (so I did not include those prompts here)</w:t>
       </w:r>
     </w:p>
     <w:p>

</xml_diff>